<commit_message>
Resources - 4/21/2026 - part 2
</commit_message>
<xml_diff>
--- a/1-Links/Links Collections.docx
+++ b/1-Links/Links Collections.docx
@@ -41,7 +41,11 @@
         <w:t>7</w:t>
       </w:r>
       <w:r>
-        <w:t>4</w:t>
+        <w:rPr>
+          <w:rFonts w:hint="cs"/>
+          <w:rtl/>
+        </w:rPr>
+        <w:t>5</w:t>
       </w:r>
     </w:p>
     <w:p>
@@ -2116,6 +2120,21 @@
       </w:r>
       <w:r>
         <w:t xml:space="preserve"> GitHub Docs</w:t>
+      </w:r>
+    </w:p>
+    <w:p>
+      <w:pPr>
+        <w:pStyle w:val="ListParagraph"/>
+        <w:numPr>
+          <w:ilvl w:val="0"/>
+          <w:numId w:val="1"/>
+        </w:numPr>
+      </w:pPr>
+      <w:r>
+        <w:t xml:space="preserve">75: </w:t>
+      </w:r>
+      <w:r>
+        <w:t>GitHub</w:t>
       </w:r>
     </w:p>
     <w:p/>

</xml_diff>

<commit_message>
Resources - 4/21/2026 - part 3
</commit_message>
<xml_diff>
--- a/1-Links/Links Collections.docx
+++ b/1-Links/Links Collections.docx
@@ -38,14 +38,7 @@
         <w:t xml:space="preserve">Last id recorded: </w:t>
       </w:r>
       <w:r>
-        <w:t>7</w:t>
-      </w:r>
-      <w:r>
-        <w:rPr>
-          <w:rFonts w:hint="cs"/>
-          <w:rtl/>
-        </w:rPr>
-        <w:t>5</w:t>
+        <w:t>76</w:t>
       </w:r>
     </w:p>
     <w:p>
@@ -712,10 +705,40 @@
     <w:p/>
     <w:p>
       <w:pPr>
+        <w:pStyle w:val="Heading3"/>
+      </w:pPr>
+      <w:r>
+        <w:lastRenderedPageBreak/>
+        <w:t>2.8-</w:t>
+      </w:r>
+      <w:r>
+        <w:t>External library link</w:t>
+      </w:r>
+    </w:p>
+    <w:p>
+      <w:pPr>
+        <w:pStyle w:val="ListParagraph"/>
+        <w:numPr>
+          <w:ilvl w:val="0"/>
+          <w:numId w:val="1"/>
+        </w:numPr>
+      </w:pPr>
+      <w:r>
+        <w:t>76</w:t>
+      </w:r>
+      <w:r>
+        <w:t xml:space="preserve">: </w:t>
+      </w:r>
+      <w:r>
+        <w:t>GitHub - Mohammed-3tef - Computer_Science_Books</w:t>
+      </w:r>
+    </w:p>
+    <w:p/>
+    <w:p>
+      <w:pPr>
         <w:pStyle w:val="Heading2"/>
       </w:pPr>
       <w:r>
-        <w:lastRenderedPageBreak/>
         <w:t>3-</w:t>
       </w:r>
       <w:r>
@@ -1367,6 +1390,7 @@
         <w:pStyle w:val="Heading3"/>
       </w:pPr>
       <w:r>
+        <w:lastRenderedPageBreak/>
         <w:t>5.2-</w:t>
       </w:r>
       <w:r>
@@ -1394,7 +1418,6 @@
         <w:pStyle w:val="Heading3"/>
       </w:pPr>
       <w:r>
-        <w:lastRenderedPageBreak/>
         <w:t>5.3-</w:t>
       </w:r>
       <w:r>
@@ -1636,6 +1659,7 @@
         <w:pStyle w:val="Heading2"/>
       </w:pPr>
       <w:r>
+        <w:lastRenderedPageBreak/>
         <w:t>9</w:t>
       </w:r>
       <w:r>
@@ -1883,6 +1907,7 @@
         <w:pStyle w:val="Heading2"/>
       </w:pPr>
       <w:r>
+        <w:lastRenderedPageBreak/>
         <w:t>12-</w:t>
       </w:r>
       <w:r>
@@ -1921,7 +1946,6 @@
         <w:pStyle w:val="Heading2"/>
       </w:pPr>
       <w:r>
-        <w:lastRenderedPageBreak/>
         <w:t>13-</w:t>
       </w:r>
       <w:r>

</xml_diff>

<commit_message>
Resources - 5/2/2026 part 2
</commit_message>
<xml_diff>
--- a/1-Links/Links Collections.docx
+++ b/1-Links/Links Collections.docx
@@ -38,7 +38,10 @@
         <w:t xml:space="preserve">Last id recorded: </w:t>
       </w:r>
       <w:r>
-        <w:t>76</w:t>
+        <w:t>7</w:t>
+      </w:r>
+      <w:r>
+        <w:t>7</w:t>
       </w:r>
     </w:p>
     <w:p>
@@ -724,10 +727,7 @@
         </w:numPr>
       </w:pPr>
       <w:r>
-        <w:t>76</w:t>
-      </w:r>
-      <w:r>
-        <w:t xml:space="preserve">: </w:t>
+        <w:t xml:space="preserve">76: </w:t>
       </w:r>
       <w:r>
         <w:t>GitHub - Mohammed-3tef - Computer_Science_Books</w:t>
@@ -851,6 +851,24 @@
       </w:r>
       <w:r>
         <w:t>Facebook</w:t>
+      </w:r>
+    </w:p>
+    <w:p>
+      <w:pPr>
+        <w:pStyle w:val="ListParagraph"/>
+        <w:numPr>
+          <w:ilvl w:val="0"/>
+          <w:numId w:val="1"/>
+        </w:numPr>
+      </w:pPr>
+      <w:r>
+        <w:t>77:</w:t>
+      </w:r>
+      <w:r>
+        <w:t xml:space="preserve"> </w:t>
+      </w:r>
+      <w:r>
+        <w:t>Reddit</w:t>
       </w:r>
     </w:p>
     <w:p/>

</xml_diff>